<commit_message>
docs: isi nama dan NIM 9 anggota kelompok
Melengkapi identitas kelompok pada README dan rencana proyek,
serta menambah baris penanggung jawab pada tabel target UTS.
</commit_message>
<xml_diff>
--- a/docs/MKKL1031-Jaringan-Klinik-Kesehatan.docx
+++ b/docs/MKKL1031-Jaringan-Klinik-Kesehatan.docx
@@ -121,10 +121,10 @@
         <w:tblLook w:firstColumn="1" w:firstRow="1" w:lastColumn="0" w:lastRow="0" w:noHBand="0" w:noVBand="1" w:val="04A0"/>
       </w:tblPr>
       <w:tblGrid>
-        <w:gridCol w:w="2493"/>
-        <w:gridCol w:w="2493"/>
-        <w:gridCol w:w="2493"/>
-        <w:gridCol w:w="2493"/>
+        <w:gridCol w:w="2578"/>
+        <w:gridCol w:w="2578"/>
+        <w:gridCol w:w="2578"/>
+        <w:gridCol w:w="2578"/>
       </w:tblGrid>
       <w:tr>
         <w:trPr>
@@ -314,7 +314,7 @@
               <w:rPr>
                 <w:sz w:val="18"/>
               </w:rPr>
-              <w:t>[Nama Anggota 2]</w:t>
+              <w:t>Asmarudin</w:t>
             </w:r>
           </w:p>
         </w:tc>
@@ -332,7 +332,7 @@
               <w:rPr>
                 <w:sz w:val="18"/>
               </w:rPr>
-              <w:t>[NIM]</w:t>
+              <w:t>23210133</w:t>
             </w:r>
           </w:p>
         </w:tc>
@@ -386,7 +386,7 @@
               <w:rPr>
                 <w:sz w:val="18"/>
               </w:rPr>
-              <w:t>[Nama Anggota 3]</w:t>
+              <w:t>Deski Taiza</w:t>
             </w:r>
           </w:p>
         </w:tc>
@@ -403,7 +403,7 @@
               <w:rPr>
                 <w:sz w:val="18"/>
               </w:rPr>
-              <w:t>[NIM]</w:t>
+              <w:t>23210003</w:t>
             </w:r>
           </w:p>
         </w:tc>
@@ -458,7 +458,7 @@
               <w:rPr>
                 <w:sz w:val="18"/>
               </w:rPr>
-              <w:t>[Nama Anggota 4]</w:t>
+              <w:t>Akhsanul Taqwim</w:t>
             </w:r>
           </w:p>
         </w:tc>
@@ -476,7 +476,7 @@
               <w:rPr>
                 <w:sz w:val="18"/>
               </w:rPr>
-              <w:t>[NIM]</w:t>
+              <w:t>23210006</w:t>
             </w:r>
           </w:p>
         </w:tc>
@@ -530,7 +530,7 @@
               <w:rPr>
                 <w:sz w:val="18"/>
               </w:rPr>
-              <w:t>[Nama Anggota 5]</w:t>
+              <w:t>Wira</w:t>
             </w:r>
           </w:p>
         </w:tc>
@@ -547,7 +547,7 @@
               <w:rPr>
                 <w:sz w:val="18"/>
               </w:rPr>
-              <w:t>[NIM]</w:t>
+              <w:t>23210045</w:t>
             </w:r>
           </w:p>
         </w:tc>
@@ -602,7 +602,7 @@
               <w:rPr>
                 <w:sz w:val="18"/>
               </w:rPr>
-              <w:t>[Nama Anggota 6]</w:t>
+              <w:t>Abadi</w:t>
             </w:r>
           </w:p>
         </w:tc>
@@ -620,7 +620,7 @@
               <w:rPr>
                 <w:sz w:val="18"/>
               </w:rPr>
-              <w:t>[NIM]</w:t>
+              <w:t>23210004</w:t>
             </w:r>
           </w:p>
         </w:tc>
@@ -638,12 +638,240 @@
               <w:rPr>
                 <w:sz w:val="18"/>
               </w:rPr>
+              <w:t>Perancangan dan pengujian skenario jalur cadangan (routing dinamis)</w:t>
+            </w:r>
+          </w:p>
+        </w:tc>
+      </w:tr>
+      <w:tr>
+        <w:tc>
+          <w:tcPr>
+            <w:tcW w:type="dxa" w:w="567"/>
+          </w:tcPr>
+          <w:p>
+            <w:pPr>
+              <w:spacing w:after="20"/>
+            </w:pPr>
+            <w:r/>
+            <w:r>
+              <w:rPr>
+                <w:sz w:val="18"/>
+              </w:rPr>
+              <w:t>7</w:t>
+            </w:r>
+          </w:p>
+        </w:tc>
+        <w:tc>
+          <w:tcPr>
+            <w:tcW w:type="dxa" w:w="2721"/>
+          </w:tcPr>
+          <w:p>
+            <w:pPr>
+              <w:spacing w:after="20"/>
+            </w:pPr>
+            <w:r/>
+            <w:r>
+              <w:rPr>
+                <w:sz w:val="18"/>
+              </w:rPr>
+              <w:t>Ferdyan Ardhani</w:t>
+            </w:r>
+          </w:p>
+        </w:tc>
+        <w:tc>
+          <w:tcPr>
+            <w:tcW w:type="dxa" w:w="1361"/>
+          </w:tcPr>
+          <w:p>
+            <w:pPr>
+              <w:spacing w:after="20"/>
+            </w:pPr>
+            <w:r/>
+            <w:r>
+              <w:rPr>
+                <w:sz w:val="18"/>
+              </w:rPr>
+              <w:t>23210039</w:t>
+            </w:r>
+          </w:p>
+        </w:tc>
+        <w:tc>
+          <w:tcPr>
+            <w:tcW w:type="dxa" w:w="4876"/>
+          </w:tcPr>
+          <w:p>
+            <w:pPr>
+              <w:spacing w:after="20"/>
+            </w:pPr>
+            <w:r/>
+            <w:r>
+              <w:rPr>
+                <w:sz w:val="18"/>
+              </w:rPr>
+              <w:t>Penyusunan tabel pengalamatan VLSM dan validasinya terhadap simulasi</w:t>
+            </w:r>
+          </w:p>
+        </w:tc>
+      </w:tr>
+      <w:tr>
+        <w:tc>
+          <w:tcPr>
+            <w:tcW w:type="dxa" w:w="567"/>
+            <w:shd w:val="clear" w:color="auto" w:fill="EDF2F7"/>
+          </w:tcPr>
+          <w:p>
+            <w:pPr>
+              <w:spacing w:after="20"/>
+            </w:pPr>
+            <w:r/>
+            <w:r>
+              <w:rPr>
+                <w:sz w:val="18"/>
+              </w:rPr>
+              <w:t>8</w:t>
+            </w:r>
+          </w:p>
+        </w:tc>
+        <w:tc>
+          <w:tcPr>
+            <w:tcW w:type="dxa" w:w="2721"/>
+            <w:shd w:val="clear" w:color="auto" w:fill="EDF2F7"/>
+          </w:tcPr>
+          <w:p>
+            <w:pPr>
+              <w:spacing w:after="20"/>
+            </w:pPr>
+            <w:r/>
+            <w:r>
+              <w:rPr>
+                <w:sz w:val="18"/>
+              </w:rPr>
+              <w:t>Muhammad Iqbal</w:t>
+            </w:r>
+          </w:p>
+        </w:tc>
+        <w:tc>
+          <w:tcPr>
+            <w:tcW w:type="dxa" w:w="1361"/>
+            <w:shd w:val="clear" w:color="auto" w:fill="EDF2F7"/>
+          </w:tcPr>
+          <w:p>
+            <w:pPr>
+              <w:spacing w:after="20"/>
+            </w:pPr>
+            <w:r/>
+            <w:r>
+              <w:rPr>
+                <w:sz w:val="18"/>
+              </w:rPr>
+              <w:t>23210142</w:t>
+            </w:r>
+          </w:p>
+        </w:tc>
+        <w:tc>
+          <w:tcPr>
+            <w:tcW w:type="dxa" w:w="4876"/>
+            <w:shd w:val="clear" w:color="auto" w:fill="EDF2F7"/>
+          </w:tcPr>
+          <w:p>
+            <w:pPr>
+              <w:spacing w:after="20"/>
+            </w:pPr>
+            <w:r/>
+            <w:r>
+              <w:rPr>
+                <w:sz w:val="18"/>
+              </w:rPr>
+              <w:t>Pengujian pembatasan akses dari sisi tamu maupun dari sisi medis</w:t>
+            </w:r>
+          </w:p>
+        </w:tc>
+      </w:tr>
+      <w:tr>
+        <w:tc>
+          <w:tcPr>
+            <w:tcW w:type="dxa" w:w="567"/>
+          </w:tcPr>
+          <w:p>
+            <w:pPr>
+              <w:spacing w:after="20"/>
+            </w:pPr>
+            <w:r/>
+            <w:r>
+              <w:rPr>
+                <w:sz w:val="18"/>
+              </w:rPr>
+              <w:t>9</w:t>
+            </w:r>
+          </w:p>
+        </w:tc>
+        <w:tc>
+          <w:tcPr>
+            <w:tcW w:type="dxa" w:w="2721"/>
+          </w:tcPr>
+          <w:p>
+            <w:pPr>
+              <w:spacing w:after="20"/>
+            </w:pPr>
+            <w:r/>
+            <w:r>
+              <w:rPr>
+                <w:sz w:val="18"/>
+              </w:rPr>
+              <w:t>Meriandi Wahyu Kurniawan</w:t>
+            </w:r>
+          </w:p>
+        </w:tc>
+        <w:tc>
+          <w:tcPr>
+            <w:tcW w:type="dxa" w:w="1361"/>
+          </w:tcPr>
+          <w:p>
+            <w:pPr>
+              <w:spacing w:after="20"/>
+            </w:pPr>
+            <w:r/>
+            <w:r>
+              <w:rPr>
+                <w:sz w:val="18"/>
+              </w:rPr>
+              <w:t>[NIM]</w:t>
+            </w:r>
+          </w:p>
+        </w:tc>
+        <w:tc>
+          <w:tcPr>
+            <w:tcW w:type="dxa" w:w="4876"/>
+          </w:tcPr>
+          <w:p>
+            <w:pPr>
+              <w:spacing w:after="20"/>
+            </w:pPr>
+            <w:r/>
+            <w:r>
+              <w:rPr>
+                <w:sz w:val="18"/>
+              </w:rPr>
               <w:t>Dokumentasi, README, dan pengelolaan repository</w:t>
             </w:r>
           </w:p>
         </w:tc>
       </w:tr>
     </w:tbl>
+    <w:p>
+      <w:pPr>
+        <w:spacing w:after="60"/>
+      </w:pPr>
+      <w:r>
+        <w:rPr>
+          <w:b w:val="0"/>
+          <w:i/>
+          <w:color w:val="475569"/>
+          <w:sz w:val="17"/>
+        </w:rPr>
+        <w:t>Kelompok berjumlah 9 orang. Panduan menetapkan 4–5 orang, sehingga jumlah ini dimintakan persetujuan dosen pada pertemuan ke-2.</w:t>
+      </w:r>
+    </w:p>
     <w:p>
       <w:pPr>
         <w:pStyle w:val="Heading1"/>
@@ -1149,9 +1377,9 @@
         <w:tblLook w:firstColumn="1" w:firstRow="1" w:lastColumn="0" w:lastRow="0" w:noHBand="0" w:noVBand="1" w:val="04A0"/>
       </w:tblPr>
       <w:tblGrid>
-        <w:gridCol w:w="3324"/>
-        <w:gridCol w:w="3324"/>
-        <w:gridCol w:w="3324"/>
+        <w:gridCol w:w="3437"/>
+        <w:gridCol w:w="3437"/>
+        <w:gridCol w:w="3437"/>
       </w:tblGrid>
       <w:tr>
         <w:trPr>
@@ -1266,7 +1494,7 @@
               <w:rPr>
                 <w:sz w:val="18"/>
               </w:rPr>
-              <w:t>Anggota 2</w:t>
+              <w:t>Asmarudin</w:t>
             </w:r>
           </w:p>
         </w:tc>
@@ -1375,7 +1603,7 @@
               <w:rPr>
                 <w:sz w:val="18"/>
               </w:rPr>
-              <w:t>Anggota 3</w:t>
+              <w:t>Deski Taiza</w:t>
             </w:r>
           </w:p>
         </w:tc>
@@ -1431,7 +1659,7 @@
               <w:rPr>
                 <w:sz w:val="18"/>
               </w:rPr>
-              <w:t>Anggota 2</w:t>
+              <w:t>Asmarudin</w:t>
             </w:r>
           </w:p>
         </w:tc>
@@ -1484,7 +1712,116 @@
               <w:rPr>
                 <w:sz w:val="18"/>
               </w:rPr>
-              <w:t>Anggota 4</w:t>
+              <w:t>Akhsanul Taqwim</w:t>
+            </w:r>
+          </w:p>
+        </w:tc>
+      </w:tr>
+      <w:tr>
+        <w:tc>
+          <w:tcPr>
+            <w:tcW w:type="dxa" w:w="3969"/>
+            <w:shd w:val="clear" w:color="auto" w:fill="EDF2F7"/>
+          </w:tcPr>
+          <w:p>
+            <w:pPr>
+              <w:spacing w:after="20"/>
+            </w:pPr>
+            <w:r/>
+            <w:r>
+              <w:rPr>
+                <w:sz w:val="18"/>
+              </w:rPr>
+              <w:t>Tabel pengalamatan VLSM dicocokkan ulang dengan konfigurasi pada simulasi</w:t>
+            </w:r>
+          </w:p>
+        </w:tc>
+        <w:tc>
+          <w:tcPr>
+            <w:tcW w:type="dxa" w:w="3742"/>
+            <w:shd w:val="clear" w:color="auto" w:fill="EDF2F7"/>
+          </w:tcPr>
+          <w:p>
+            <w:pPr>
+              <w:spacing w:after="20"/>
+            </w:pPr>
+            <w:r/>
+            <w:r>
+              <w:rPr>
+                <w:sz w:val="18"/>
+              </w:rPr>
+              <w:t>Dokumen tabel pengalamatan versi terkoreksi beserta catatan pemeriksaan</w:t>
+            </w:r>
+          </w:p>
+        </w:tc>
+        <w:tc>
+          <w:tcPr>
+            <w:tcW w:type="dxa" w:w="1814"/>
+            <w:shd w:val="clear" w:color="auto" w:fill="EDF2F7"/>
+          </w:tcPr>
+          <w:p>
+            <w:pPr>
+              <w:spacing w:after="20"/>
+            </w:pPr>
+            <w:r/>
+            <w:r>
+              <w:rPr>
+                <w:sz w:val="18"/>
+              </w:rPr>
+              <w:t>Abadi</w:t>
+            </w:r>
+          </w:p>
+        </w:tc>
+      </w:tr>
+      <w:tr>
+        <w:tc>
+          <w:tcPr>
+            <w:tcW w:type="dxa" w:w="3969"/>
+          </w:tcPr>
+          <w:p>
+            <w:pPr>
+              <w:spacing w:after="20"/>
+            </w:pPr>
+            <w:r/>
+            <w:r>
+              <w:rPr>
+                <w:sz w:val="18"/>
+              </w:rPr>
+              <w:t>Jalur cadangan diuji dengan memutus satu jalur penghubung</w:t>
+            </w:r>
+          </w:p>
+        </w:tc>
+        <w:tc>
+          <w:tcPr>
+            <w:tcW w:type="dxa" w:w="3742"/>
+          </w:tcPr>
+          <w:p>
+            <w:pPr>
+              <w:spacing w:after="20"/>
+            </w:pPr>
+            <w:r/>
+            <w:r>
+              <w:rPr>
+                <w:sz w:val="18"/>
+              </w:rPr>
+              <w:t>Hasil pemeriksaan jalur sebelum dan sesudah satu jalur diputus</w:t>
+            </w:r>
+          </w:p>
+        </w:tc>
+        <w:tc>
+          <w:tcPr>
+            <w:tcW w:type="dxa" w:w="1814"/>
+          </w:tcPr>
+          <w:p>
+            <w:pPr>
+              <w:spacing w:after="20"/>
+            </w:pPr>
+            <w:r/>
+            <w:r>
+              <w:rPr>
+                <w:sz w:val="18"/>
+              </w:rPr>
+              <w:t>Ferdyan Ardhani</w:t>
             </w:r>
           </w:p>
         </w:tc>
@@ -1540,7 +1877,7 @@
               <w:rPr>
                 <w:sz w:val="18"/>
               </w:rPr>
-              <w:t>Anggota 6</w:t>
+              <w:t>Meriandi Wahyu Kurniawan</w:t>
             </w:r>
           </w:p>
         </w:tc>
@@ -1707,9 +2044,9 @@
         <w:tblLook w:firstColumn="1" w:firstRow="1" w:lastColumn="0" w:lastRow="0" w:noHBand="0" w:noVBand="1" w:val="04A0"/>
       </w:tblPr>
       <w:tblGrid>
-        <w:gridCol w:w="3324"/>
-        <w:gridCol w:w="3324"/>
-        <w:gridCol w:w="3324"/>
+        <w:gridCol w:w="3437"/>
+        <w:gridCol w:w="3437"/>
+        <w:gridCol w:w="3437"/>
       </w:tblGrid>
       <w:tr>
         <w:trPr>
@@ -2283,8 +2620,8 @@
         <w:tblLook w:firstColumn="1" w:firstRow="1" w:lastColumn="0" w:lastRow="0" w:noHBand="0" w:noVBand="1" w:val="04A0"/>
       </w:tblPr>
       <w:tblGrid>
-        <w:gridCol w:w="4986"/>
-        <w:gridCol w:w="4986"/>
+        <w:gridCol w:w="5156"/>
+        <w:gridCol w:w="5156"/>
       </w:tblGrid>
       <w:tr>
         <w:trPr>
@@ -2536,7 +2873,7 @@
     </w:p>
     <w:sectPr>
       <w:pgSz w:w="12240" w:h="15840"/>
-      <w:pgMar w:top="1077" w:right="1134" w:bottom="1077" w:left="1134" w:header="720" w:footer="720" w:gutter="0"/>
+      <w:pgMar w:top="850" w:right="964" w:bottom="794" w:left="964" w:header="720" w:footer="720" w:gutter="0"/>
       <w:cols w:space="720"/>
       <w:docGrid w:linePitch="360"/>
     </w:sectPr>
@@ -2908,11 +3245,11 @@
     <w:qFormat/>
     <w:rsid w:val="00FC693F"/>
     <w:pPr>
-      <w:spacing w:after="80" w:line="247" w:lineRule="auto"/>
+      <w:spacing w:after="60" w:line="235" w:lineRule="auto"/>
     </w:pPr>
     <w:rPr>
       <w:rFonts w:ascii="Calibri" w:hAnsi="Calibri"/>
-      <w:sz w:val="21"/>
+      <w:sz w:val="20"/>
     </w:rPr>
   </w:style>
   <w:style w:type="paragraph" w:styleId="Header">
@@ -2970,7 +3307,7 @@
     <w:pPr>
       <w:keepNext/>
       <w:keepLines/>
-      <w:spacing w:before="180" w:after="60"/>
+      <w:spacing w:before="120" w:after="40"/>
       <w:outlineLvl w:val="0"/>
     </w:pPr>
     <w:rPr>
@@ -2978,7 +3315,7 @@
       <w:b/>
       <w:bCs/>
       <w:color w:val="1F3A5F"/>
-      <w:sz w:val="25"/>
+      <w:sz w:val="23"/>
       <w:szCs w:val="28"/>
     </w:rPr>
   </w:style>
@@ -2994,7 +3331,7 @@
     <w:pPr>
       <w:keepNext/>
       <w:keepLines/>
-      <w:spacing w:before="180" w:after="60"/>
+      <w:spacing w:before="120" w:after="40"/>
       <w:outlineLvl w:val="1"/>
     </w:pPr>
     <w:rPr>
@@ -3002,7 +3339,7 @@
       <w:b/>
       <w:bCs/>
       <w:color w:val="1F3A5F"/>
-      <w:sz w:val="22"/>
+      <w:sz w:val="21"/>
       <w:szCs w:val="26"/>
     </w:rPr>
   </w:style>
@@ -3441,12 +3778,12 @@
       <w:numPr>
         <w:numId w:val="1"/>
       </w:numPr>
-      <w:spacing w:after="30" w:line="247" w:lineRule="auto"/>
+      <w:spacing w:after="20" w:line="235" w:lineRule="auto"/>
       <w:contextualSpacing/>
     </w:pPr>
     <w:rPr>
       <w:rFonts w:ascii="Calibri" w:hAnsi="Calibri"/>
-      <w:sz w:val="21"/>
+      <w:sz w:val="20"/>
     </w:rPr>
   </w:style>
   <w:style w:type="paragraph" w:styleId="ListBullet2">
@@ -3485,12 +3822,12 @@
       <w:numPr>
         <w:numId w:val="5"/>
       </w:numPr>
-      <w:spacing w:after="30" w:line="247" w:lineRule="auto"/>
+      <w:spacing w:after="20" w:line="235" w:lineRule="auto"/>
       <w:contextualSpacing/>
     </w:pPr>
     <w:rPr>
       <w:rFonts w:ascii="Calibri" w:hAnsi="Calibri"/>
-      <w:sz w:val="21"/>
+      <w:sz w:val="20"/>
     </w:rPr>
   </w:style>
   <w:style w:type="paragraph" w:styleId="ListNumber2">

</xml_diff>